<commit_message>
docs: define emergent architecture determination process
Establish the evidence-driven process for auditing architectural gaps, determining emergent responsibilities, and authorizing capability evolution.
</commit_message>
<xml_diff>
--- a/docs/DOC-028 — Proceso de Determinación de Responsabilidades Arquitectónicas Emergentes.docx
+++ b/docs/DOC-028 — Proceso de Determinación de Responsabilidades Arquitectónicas Emergentes.docx
@@ -7919,6 +7919,23 @@
           <w:rtl w:val="0"/>
         </w:rPr>
         <w:t xml:space="preserve">24. Aplicación inicial del proceso</w:t>
+        <w:br w:type="textWrapping"/>
+      </w:r>
+    </w:p>
+    <w:p>
+      <w:pPr>
+        <w:rPr/>
+      </w:pPr>
+      <w:r>
+        <w:rPr>
+          <w:rtl w:val="0"/>
+        </w:rPr>
+        <w:t xml:space="preserve">La siguiente sección constituye únicamente un ejemplo completo de aplicación del proceso definido por DOC-028. No forma parte del proceso normativo y no limita futuras aplicaciones del mismo. </w:t>
+      </w:r>
+      <w:r>
+        <w:rPr>
+          <w:rtl w:val="0"/>
+        </w:rPr>
       </w:r>
     </w:p>
     <w:p>
@@ -9302,14 +9319,23 @@
     </w:p>
     <w:p>
       <w:pPr>
+        <w:pStyle w:val="Heading2"/>
         <w:spacing w:after="240" w:before="240" w:lineRule="auto"/>
         <w:rPr/>
       </w:pPr>
+      <w:bookmarkStart w:colFirst="0" w:colLast="0" w:name="_e8oa9rhqprtw" w:id="77"/>
+      <w:bookmarkEnd w:id="77"/>
       <w:r>
         <w:rPr>
           <w:rtl w:val="0"/>
         </w:rPr>
         <w:t xml:space="preserve">Cuando la evidencia sea suficiente, el razonamiento deberá cerrarse y el proceso avanzará a documentación.</w:t>
+        <w:br w:type="textWrapping"/>
+        <w:br w:type="textWrapping"/>
+        <w:t xml:space="preserve">DA-028-011 </w:t>
+        <w:br w:type="textWrapping"/>
+        <w:br w:type="textWrapping"/>
+        <w:t xml:space="preserve">DOC-028 no podrá modificar la arquitectura existente. Su único resultado posible será: • no incorporar ninguna responsabilidad, • evolucionar una Capability existente, • o autorizar la documentación de una nueva Capability. </w:t>
       </w:r>
     </w:p>
     <w:p>
@@ -9340,8 +9366,8 @@
           <w:szCs w:val="46"/>
         </w:rPr>
       </w:pPr>
-      <w:bookmarkStart w:colFirst="0" w:colLast="0" w:name="_4ogf8l6cfht8" w:id="77"/>
-      <w:bookmarkEnd w:id="77"/>
+      <w:bookmarkStart w:colFirst="0" w:colLast="0" w:name="_4ogf8l6cfht8" w:id="78"/>
+      <w:bookmarkEnd w:id="78"/>
       <w:r>
         <w:rPr>
           <w:b w:val="1"/>
@@ -9569,8 +9595,8 @@
           <w:szCs w:val="46"/>
         </w:rPr>
       </w:pPr>
-      <w:bookmarkStart w:colFirst="0" w:colLast="0" w:name="_bsapf8s37xt7" w:id="78"/>
-      <w:bookmarkEnd w:id="78"/>
+      <w:bookmarkStart w:colFirst="0" w:colLast="0" w:name="_bsapf8s37xt7" w:id="79"/>
+      <w:bookmarkEnd w:id="79"/>
       <w:r>
         <w:rPr>
           <w:b w:val="1"/>
@@ -9595,8 +9621,8 @@
           <w:szCs w:val="34"/>
         </w:rPr>
       </w:pPr>
-      <w:bookmarkStart w:colFirst="0" w:colLast="0" w:name="_kf2slldqeq5k" w:id="79"/>
-      <w:bookmarkEnd w:id="79"/>
+      <w:bookmarkStart w:colFirst="0" w:colLast="0" w:name="_kf2slldqeq5k" w:id="80"/>
+      <w:bookmarkEnd w:id="80"/>
       <w:r>
         <w:rPr>
           <w:b w:val="1"/>
@@ -9650,8 +9676,8 @@
           <w:szCs w:val="34"/>
         </w:rPr>
       </w:pPr>
-      <w:bookmarkStart w:colFirst="0" w:colLast="0" w:name="_y3oki8bcmfkw" w:id="80"/>
-      <w:bookmarkEnd w:id="80"/>
+      <w:bookmarkStart w:colFirst="0" w:colLast="0" w:name="_y3oki8bcmfkw" w:id="81"/>
+      <w:bookmarkEnd w:id="81"/>
       <w:r>
         <w:rPr>
           <w:b w:val="1"/>
@@ -9705,8 +9731,8 @@
           <w:szCs w:val="34"/>
         </w:rPr>
       </w:pPr>
-      <w:bookmarkStart w:colFirst="0" w:colLast="0" w:name="_1atw2cr3eaer" w:id="81"/>
-      <w:bookmarkEnd w:id="81"/>
+      <w:bookmarkStart w:colFirst="0" w:colLast="0" w:name="_1atw2cr3eaer" w:id="82"/>
+      <w:bookmarkEnd w:id="82"/>
       <w:r>
         <w:rPr>
           <w:b w:val="1"/>
@@ -9760,8 +9786,8 @@
           <w:szCs w:val="34"/>
         </w:rPr>
       </w:pPr>
-      <w:bookmarkStart w:colFirst="0" w:colLast="0" w:name="_5napbvp6tcwx" w:id="82"/>
-      <w:bookmarkEnd w:id="82"/>
+      <w:bookmarkStart w:colFirst="0" w:colLast="0" w:name="_5napbvp6tcwx" w:id="83"/>
+      <w:bookmarkEnd w:id="83"/>
       <w:r>
         <w:rPr>
           <w:b w:val="1"/>
@@ -9815,8 +9841,8 @@
           <w:szCs w:val="34"/>
         </w:rPr>
       </w:pPr>
-      <w:bookmarkStart w:colFirst="0" w:colLast="0" w:name="_ckg0viuxrt92" w:id="83"/>
-      <w:bookmarkEnd w:id="83"/>
+      <w:bookmarkStart w:colFirst="0" w:colLast="0" w:name="_ckg0viuxrt92" w:id="84"/>
+      <w:bookmarkEnd w:id="84"/>
       <w:r>
         <w:rPr>
           <w:b w:val="1"/>
@@ -9870,8 +9896,8 @@
           <w:szCs w:val="34"/>
         </w:rPr>
       </w:pPr>
-      <w:bookmarkStart w:colFirst="0" w:colLast="0" w:name="_u2rxvshet70t" w:id="84"/>
-      <w:bookmarkEnd w:id="84"/>
+      <w:bookmarkStart w:colFirst="0" w:colLast="0" w:name="_u2rxvshet70t" w:id="85"/>
+      <w:bookmarkEnd w:id="85"/>
       <w:r>
         <w:rPr>
           <w:b w:val="1"/>
@@ -9940,8 +9966,8 @@
           <w:szCs w:val="46"/>
         </w:rPr>
       </w:pPr>
-      <w:bookmarkStart w:colFirst="0" w:colLast="0" w:name="_u7hvfr1wm50f" w:id="85"/>
-      <w:bookmarkEnd w:id="85"/>
+      <w:bookmarkStart w:colFirst="0" w:colLast="0" w:name="_u7hvfr1wm50f" w:id="86"/>
+      <w:bookmarkEnd w:id="86"/>
       <w:r>
         <w:rPr>
           <w:b w:val="1"/>
@@ -10110,8 +10136,8 @@
           <w:szCs w:val="46"/>
         </w:rPr>
       </w:pPr>
-      <w:bookmarkStart w:colFirst="0" w:colLast="0" w:name="_sokbk5y5shz9" w:id="86"/>
-      <w:bookmarkEnd w:id="86"/>
+      <w:bookmarkStart w:colFirst="0" w:colLast="0" w:name="_sokbk5y5shz9" w:id="87"/>
+      <w:bookmarkEnd w:id="87"/>
       <w:r>
         <w:rPr>
           <w:b w:val="1"/>
@@ -10320,6 +10346,9 @@
         <w:rPr>
           <w:rtl w:val="0"/>
         </w:rPr>
+        <w:br w:type="textWrapping"/>
+        <w:br w:type="textWrapping"/>
+        <w:t xml:space="preserve">DOC-028 se convierte, a partir de su aprobación, en el procedimiento oficial mediante el cual TramitaGO Quant Platform determina la aparición de nuevas responsabilidades arquitectónicas. Toda futura Capability deberá justificar su existencia mediante este proceso o mediante una revisión equivalente aprobada. </w:t>
       </w:r>
     </w:p>
     <w:p>

</xml_diff>